<commit_message>
Level 4: Rule-based threat detection — PortScan, SynFlood, PingSweep rules + 7 tests
</commit_message>
<xml_diff>
--- a/Planning.docx
+++ b/Planning.docx
@@ -896,8 +896,18 @@
           <w:sz w:val="20"/>
           <w:szCs w:val="20"/>
         </w:rPr>
-        <w:t xml:space="preserve">                │ Network Traffic  │</w:t>
-      </w:r>
+        <w:t xml:space="preserve">                │ Network </w:t>
+      </w:r>
+      <w:proofErr w:type="gramStart"/>
+      <w:r>
+        <w:rPr>
+          <w:rFonts w:ascii="Courier New" w:eastAsia="Times New Roman" w:hAnsi="Courier New" w:cs="Courier New"/>
+          <w:sz w:val="20"/>
+          <w:szCs w:val="20"/>
+        </w:rPr>
+        <w:t>Traffic  │</w:t>
+      </w:r>
+      <w:proofErr w:type="gramEnd"/>
     </w:p>
     <w:p>
       <w:pPr>
@@ -1112,7 +1122,43 @@
           <w:sz w:val="20"/>
           <w:szCs w:val="20"/>
         </w:rPr>
-        <w:t xml:space="preserve">                │ Scapy / Zeek      │</w:t>
+        <w:t xml:space="preserve">                │ </w:t>
+      </w:r>
+      <w:proofErr w:type="spellStart"/>
+      <w:r>
+        <w:rPr>
+          <w:rFonts w:ascii="Courier New" w:eastAsia="Times New Roman" w:hAnsi="Courier New" w:cs="Courier New"/>
+          <w:sz w:val="20"/>
+          <w:szCs w:val="20"/>
+        </w:rPr>
+        <w:t>Scapy</w:t>
+      </w:r>
+      <w:proofErr w:type="spellEnd"/>
+      <w:r>
+        <w:rPr>
+          <w:rFonts w:ascii="Courier New" w:eastAsia="Times New Roman" w:hAnsi="Courier New" w:cs="Courier New"/>
+          <w:sz w:val="20"/>
+          <w:szCs w:val="20"/>
+        </w:rPr>
+        <w:t xml:space="preserve"> / </w:t>
+      </w:r>
+      <w:proofErr w:type="spellStart"/>
+      <w:r>
+        <w:rPr>
+          <w:rFonts w:ascii="Courier New" w:eastAsia="Times New Roman" w:hAnsi="Courier New" w:cs="Courier New"/>
+          <w:sz w:val="20"/>
+          <w:szCs w:val="20"/>
+        </w:rPr>
+        <w:t>Zeek</w:t>
+      </w:r>
+      <w:proofErr w:type="spellEnd"/>
+      <w:r>
+        <w:rPr>
+          <w:rFonts w:ascii="Courier New" w:eastAsia="Times New Roman" w:hAnsi="Courier New" w:cs="Courier New"/>
+          <w:sz w:val="20"/>
+          <w:szCs w:val="20"/>
+        </w:rPr>
+        <w:t xml:space="preserve">      │</w:t>
       </w:r>
     </w:p>
     <w:p>
@@ -1580,7 +1626,25 @@
           <w:sz w:val="20"/>
           <w:szCs w:val="20"/>
         </w:rPr>
-        <w:t xml:space="preserve"> │ Rules / Indicators  │    │ Isolation Forest    │</w:t>
+        <w:t xml:space="preserve"> │ Rules / </w:t>
+      </w:r>
+      <w:proofErr w:type="gramStart"/>
+      <w:r>
+        <w:rPr>
+          <w:rFonts w:ascii="Courier New" w:eastAsia="Times New Roman" w:hAnsi="Courier New" w:cs="Courier New"/>
+          <w:sz w:val="20"/>
+          <w:szCs w:val="20"/>
+        </w:rPr>
+        <w:t>Indicators  │</w:t>
+      </w:r>
+      <w:proofErr w:type="gramEnd"/>
+      <w:r>
+        <w:rPr>
+          <w:rFonts w:ascii="Courier New" w:eastAsia="Times New Roman" w:hAnsi="Courier New" w:cs="Courier New"/>
+          <w:sz w:val="20"/>
+          <w:szCs w:val="20"/>
+        </w:rPr>
+        <w:t xml:space="preserve">    │ Isolation Forest    │</w:t>
       </w:r>
     </w:p>
     <w:p>
@@ -2229,7 +2293,25 @@
           <w:sz w:val="20"/>
           <w:szCs w:val="20"/>
         </w:rPr>
-        <w:t xml:space="preserve">       │ Streamlit    │       │ Email/Telegram│</w:t>
+        <w:t xml:space="preserve">       │ </w:t>
+      </w:r>
+      <w:proofErr w:type="spellStart"/>
+      <w:r>
+        <w:rPr>
+          <w:rFonts w:ascii="Courier New" w:eastAsia="Times New Roman" w:hAnsi="Courier New" w:cs="Courier New"/>
+          <w:sz w:val="20"/>
+          <w:szCs w:val="20"/>
+        </w:rPr>
+        <w:t>Streamlit</w:t>
+      </w:r>
+      <w:proofErr w:type="spellEnd"/>
+      <w:r>
+        <w:rPr>
+          <w:rFonts w:ascii="Courier New" w:eastAsia="Times New Roman" w:hAnsi="Courier New" w:cs="Courier New"/>
+          <w:sz w:val="20"/>
+          <w:szCs w:val="20"/>
+        </w:rPr>
+        <w:t xml:space="preserve">    │       │ Email/Telegram│</w:t>
       </w:r>
     </w:p>
     <w:p>
@@ -2487,7 +2569,25 @@
           <w:sz w:val="24"/>
           <w:szCs w:val="24"/>
         </w:rPr>
-        <w:t>Integrate Zeek logs</w:t>
+        <w:t xml:space="preserve">Integrate </w:t>
+      </w:r>
+      <w:proofErr w:type="spellStart"/>
+      <w:r>
+        <w:rPr>
+          <w:rFonts w:ascii="Times New Roman" w:eastAsia="Times New Roman" w:hAnsi="Times New Roman" w:cs="Times New Roman"/>
+          <w:sz w:val="24"/>
+          <w:szCs w:val="24"/>
+        </w:rPr>
+        <w:t>Zeek</w:t>
+      </w:r>
+      <w:proofErr w:type="spellEnd"/>
+      <w:r>
+        <w:rPr>
+          <w:rFonts w:ascii="Times New Roman" w:eastAsia="Times New Roman" w:hAnsi="Times New Roman" w:cs="Times New Roman"/>
+          <w:sz w:val="24"/>
+          <w:szCs w:val="24"/>
+        </w:rPr>
+        <w:t xml:space="preserve"> logs</w:t>
       </w:r>
     </w:p>
     <w:p>
@@ -4268,6 +4368,7 @@
           <w:szCs w:val="24"/>
         </w:rPr>
       </w:pPr>
+      <w:proofErr w:type="spellStart"/>
       <w:r>
         <w:rPr>
           <w:rFonts w:ascii="Times New Roman" w:eastAsia="Times New Roman" w:hAnsi="Times New Roman" w:cs="Times New Roman"/>
@@ -4276,6 +4377,7 @@
         </w:rPr>
         <w:t>Streamlit</w:t>
       </w:r>
+      <w:proofErr w:type="spellEnd"/>
     </w:p>
     <w:p>
       <w:pPr>
@@ -4290,13 +4392,23 @@
           <w:szCs w:val="24"/>
         </w:rPr>
       </w:pPr>
-      <w:r>
-        <w:rPr>
-          <w:rFonts w:ascii="Times New Roman" w:eastAsia="Times New Roman" w:hAnsi="Times New Roman" w:cs="Times New Roman"/>
-          <w:sz w:val="24"/>
-          <w:szCs w:val="24"/>
-        </w:rPr>
-        <w:t>FastAPI backend</w:t>
+      <w:proofErr w:type="spellStart"/>
+      <w:r>
+        <w:rPr>
+          <w:rFonts w:ascii="Times New Roman" w:eastAsia="Times New Roman" w:hAnsi="Times New Roman" w:cs="Times New Roman"/>
+          <w:sz w:val="24"/>
+          <w:szCs w:val="24"/>
+        </w:rPr>
+        <w:t>FastAPI</w:t>
+      </w:r>
+      <w:proofErr w:type="spellEnd"/>
+      <w:r>
+        <w:rPr>
+          <w:rFonts w:ascii="Times New Roman" w:eastAsia="Times New Roman" w:hAnsi="Times New Roman" w:cs="Times New Roman"/>
+          <w:sz w:val="24"/>
+          <w:szCs w:val="24"/>
+        </w:rPr>
+        <w:t xml:space="preserve"> backend</w:t>
       </w:r>
     </w:p>
     <w:p>
@@ -4769,6 +4881,7 @@
           <w:szCs w:val="24"/>
         </w:rPr>
       </w:pPr>
+      <w:proofErr w:type="spellStart"/>
       <w:r>
         <w:rPr>
           <w:rFonts w:ascii="Times New Roman" w:eastAsia="Times New Roman" w:hAnsi="Times New Roman" w:cs="Times New Roman"/>
@@ -4777,6 +4890,7 @@
         </w:rPr>
         <w:t>Zeek</w:t>
       </w:r>
+      <w:proofErr w:type="spellEnd"/>
     </w:p>
     <w:p>
       <w:pPr>
@@ -5320,13 +5434,23 @@
           <w:szCs w:val="24"/>
         </w:rPr>
       </w:pPr>
-      <w:r>
-        <w:rPr>
-          <w:rFonts w:ascii="Times New Roman" w:eastAsia="Times New Roman" w:hAnsi="Times New Roman" w:cs="Times New Roman"/>
-          <w:sz w:val="24"/>
-          <w:szCs w:val="24"/>
-        </w:rPr>
-        <w:t xml:space="preserve">So during an interview, this one project gives you </w:t>
+      <w:proofErr w:type="gramStart"/>
+      <w:r>
+        <w:rPr>
+          <w:rFonts w:ascii="Times New Roman" w:eastAsia="Times New Roman" w:hAnsi="Times New Roman" w:cs="Times New Roman"/>
+          <w:sz w:val="24"/>
+          <w:szCs w:val="24"/>
+        </w:rPr>
+        <w:t>So</w:t>
+      </w:r>
+      <w:proofErr w:type="gramEnd"/>
+      <w:r>
+        <w:rPr>
+          <w:rFonts w:ascii="Times New Roman" w:eastAsia="Times New Roman" w:hAnsi="Times New Roman" w:cs="Times New Roman"/>
+          <w:sz w:val="24"/>
+          <w:szCs w:val="24"/>
+        </w:rPr>
+        <w:t xml:space="preserve"> during an interview, this one project gives you </w:t>
       </w:r>
       <w:r>
         <w:rPr>
@@ -6951,6 +7075,7 @@
           <w:szCs w:val="24"/>
         </w:rPr>
       </w:pPr>
+      <w:proofErr w:type="spellStart"/>
       <w:r>
         <w:rPr>
           <w:rFonts w:ascii="Times New Roman" w:eastAsia="Times New Roman" w:hAnsi="Times New Roman" w:cs="Times New Roman"/>
@@ -6959,6 +7084,7 @@
         </w:rPr>
         <w:t>Zeek</w:t>
       </w:r>
+      <w:proofErr w:type="spellEnd"/>
     </w:p>
     <w:p>
       <w:pPr>
@@ -8471,6 +8597,7 @@
           <w:szCs w:val="20"/>
         </w:rPr>
       </w:pPr>
+      <w:proofErr w:type="spellStart"/>
       <w:r>
         <w:rPr>
           <w:rFonts w:ascii="Courier New" w:eastAsia="Times New Roman" w:hAnsi="Courier New" w:cs="Courier New"/>
@@ -8479,6 +8606,7 @@
         </w:rPr>
         <w:t>Zeek</w:t>
       </w:r>
+      <w:proofErr w:type="spellEnd"/>
     </w:p>
     <w:p>
       <w:pPr>
@@ -8732,6 +8860,7 @@
           <w:szCs w:val="20"/>
         </w:rPr>
       </w:pPr>
+      <w:proofErr w:type="spellStart"/>
       <w:r>
         <w:rPr>
           <w:rFonts w:ascii="Courier New" w:eastAsia="Times New Roman" w:hAnsi="Courier New" w:cs="Courier New"/>
@@ -8740,34 +8869,36 @@
         </w:rPr>
         <w:t>Scapy</w:t>
       </w:r>
-    </w:p>
-    <w:p>
-      <w:pPr>
-        <w:tabs>
-          <w:tab w:val="left" w:pos="916"/>
-          <w:tab w:val="left" w:pos="1832"/>
-          <w:tab w:val="left" w:pos="2748"/>
-          <w:tab w:val="left" w:pos="3664"/>
-          <w:tab w:val="left" w:pos="4580"/>
-          <w:tab w:val="left" w:pos="5496"/>
-          <w:tab w:val="left" w:pos="6412"/>
-          <w:tab w:val="left" w:pos="7328"/>
-          <w:tab w:val="left" w:pos="8244"/>
-          <w:tab w:val="left" w:pos="9160"/>
-          <w:tab w:val="left" w:pos="10076"/>
-          <w:tab w:val="left" w:pos="10992"/>
-          <w:tab w:val="left" w:pos="11908"/>
-          <w:tab w:val="left" w:pos="12824"/>
-          <w:tab w:val="left" w:pos="13740"/>
-          <w:tab w:val="left" w:pos="14656"/>
-        </w:tabs>
-        <w:spacing w:after="0" w:line="240" w:lineRule="auto"/>
-        <w:rPr>
-          <w:rFonts w:ascii="Courier New" w:eastAsia="Times New Roman" w:hAnsi="Courier New" w:cs="Courier New"/>
-          <w:sz w:val="20"/>
-          <w:szCs w:val="20"/>
-        </w:rPr>
-      </w:pPr>
+      <w:proofErr w:type="spellEnd"/>
+    </w:p>
+    <w:p>
+      <w:pPr>
+        <w:tabs>
+          <w:tab w:val="left" w:pos="916"/>
+          <w:tab w:val="left" w:pos="1832"/>
+          <w:tab w:val="left" w:pos="2748"/>
+          <w:tab w:val="left" w:pos="3664"/>
+          <w:tab w:val="left" w:pos="4580"/>
+          <w:tab w:val="left" w:pos="5496"/>
+          <w:tab w:val="left" w:pos="6412"/>
+          <w:tab w:val="left" w:pos="7328"/>
+          <w:tab w:val="left" w:pos="8244"/>
+          <w:tab w:val="left" w:pos="9160"/>
+          <w:tab w:val="left" w:pos="10076"/>
+          <w:tab w:val="left" w:pos="10992"/>
+          <w:tab w:val="left" w:pos="11908"/>
+          <w:tab w:val="left" w:pos="12824"/>
+          <w:tab w:val="left" w:pos="13740"/>
+          <w:tab w:val="left" w:pos="14656"/>
+        </w:tabs>
+        <w:spacing w:after="0" w:line="240" w:lineRule="auto"/>
+        <w:rPr>
+          <w:rFonts w:ascii="Courier New" w:eastAsia="Times New Roman" w:hAnsi="Courier New" w:cs="Courier New"/>
+          <w:sz w:val="20"/>
+          <w:szCs w:val="20"/>
+        </w:rPr>
+      </w:pPr>
+      <w:proofErr w:type="spellStart"/>
       <w:r>
         <w:rPr>
           <w:rFonts w:ascii="Courier New" w:eastAsia="Times New Roman" w:hAnsi="Courier New" w:cs="Courier New"/>
@@ -8776,6 +8907,7 @@
         </w:rPr>
         <w:t>Zeek</w:t>
       </w:r>
+      <w:proofErr w:type="spellEnd"/>
     </w:p>
     <w:p>
       <w:pPr>
@@ -9020,6 +9152,7 @@
           <w:szCs w:val="20"/>
         </w:rPr>
       </w:pPr>
+      <w:proofErr w:type="spellStart"/>
       <w:r>
         <w:rPr>
           <w:rFonts w:ascii="Courier New" w:eastAsia="Times New Roman" w:hAnsi="Courier New" w:cs="Courier New"/>
@@ -9028,34 +9161,36 @@
         </w:rPr>
         <w:t>FastAPI</w:t>
       </w:r>
-    </w:p>
-    <w:p>
-      <w:pPr>
-        <w:tabs>
-          <w:tab w:val="left" w:pos="916"/>
-          <w:tab w:val="left" w:pos="1832"/>
-          <w:tab w:val="left" w:pos="2748"/>
-          <w:tab w:val="left" w:pos="3664"/>
-          <w:tab w:val="left" w:pos="4580"/>
-          <w:tab w:val="left" w:pos="5496"/>
-          <w:tab w:val="left" w:pos="6412"/>
-          <w:tab w:val="left" w:pos="7328"/>
-          <w:tab w:val="left" w:pos="8244"/>
-          <w:tab w:val="left" w:pos="9160"/>
-          <w:tab w:val="left" w:pos="10076"/>
-          <w:tab w:val="left" w:pos="10992"/>
-          <w:tab w:val="left" w:pos="11908"/>
-          <w:tab w:val="left" w:pos="12824"/>
-          <w:tab w:val="left" w:pos="13740"/>
-          <w:tab w:val="left" w:pos="14656"/>
-        </w:tabs>
-        <w:spacing w:after="0" w:line="240" w:lineRule="auto"/>
-        <w:rPr>
-          <w:rFonts w:ascii="Courier New" w:eastAsia="Times New Roman" w:hAnsi="Courier New" w:cs="Courier New"/>
-          <w:sz w:val="20"/>
-          <w:szCs w:val="20"/>
-        </w:rPr>
-      </w:pPr>
+      <w:proofErr w:type="spellEnd"/>
+    </w:p>
+    <w:p>
+      <w:pPr>
+        <w:tabs>
+          <w:tab w:val="left" w:pos="916"/>
+          <w:tab w:val="left" w:pos="1832"/>
+          <w:tab w:val="left" w:pos="2748"/>
+          <w:tab w:val="left" w:pos="3664"/>
+          <w:tab w:val="left" w:pos="4580"/>
+          <w:tab w:val="left" w:pos="5496"/>
+          <w:tab w:val="left" w:pos="6412"/>
+          <w:tab w:val="left" w:pos="7328"/>
+          <w:tab w:val="left" w:pos="8244"/>
+          <w:tab w:val="left" w:pos="9160"/>
+          <w:tab w:val="left" w:pos="10076"/>
+          <w:tab w:val="left" w:pos="10992"/>
+          <w:tab w:val="left" w:pos="11908"/>
+          <w:tab w:val="left" w:pos="12824"/>
+          <w:tab w:val="left" w:pos="13740"/>
+          <w:tab w:val="left" w:pos="14656"/>
+        </w:tabs>
+        <w:spacing w:after="0" w:line="240" w:lineRule="auto"/>
+        <w:rPr>
+          <w:rFonts w:ascii="Courier New" w:eastAsia="Times New Roman" w:hAnsi="Courier New" w:cs="Courier New"/>
+          <w:sz w:val="20"/>
+          <w:szCs w:val="20"/>
+        </w:rPr>
+      </w:pPr>
+      <w:proofErr w:type="spellStart"/>
       <w:r>
         <w:rPr>
           <w:rFonts w:ascii="Courier New" w:eastAsia="Times New Roman" w:hAnsi="Courier New" w:cs="Courier New"/>
@@ -9064,6 +9199,7 @@
         </w:rPr>
         <w:t>Streamlit</w:t>
       </w:r>
+      <w:proofErr w:type="spellEnd"/>
     </w:p>
     <w:p>
       <w:pPr>
@@ -9514,6 +9650,7 @@
           <w:szCs w:val="20"/>
         </w:rPr>
       </w:pPr>
+      <w:proofErr w:type="spellStart"/>
       <w:r>
         <w:rPr>
           <w:rFonts w:ascii="Courier New" w:eastAsia="Times New Roman" w:hAnsi="Courier New" w:cs="Courier New"/>
@@ -9522,34 +9659,36 @@
         </w:rPr>
         <w:t>VirusTotal</w:t>
       </w:r>
-    </w:p>
-    <w:p>
-      <w:pPr>
-        <w:tabs>
-          <w:tab w:val="left" w:pos="916"/>
-          <w:tab w:val="left" w:pos="1832"/>
-          <w:tab w:val="left" w:pos="2748"/>
-          <w:tab w:val="left" w:pos="3664"/>
-          <w:tab w:val="left" w:pos="4580"/>
-          <w:tab w:val="left" w:pos="5496"/>
-          <w:tab w:val="left" w:pos="6412"/>
-          <w:tab w:val="left" w:pos="7328"/>
-          <w:tab w:val="left" w:pos="8244"/>
-          <w:tab w:val="left" w:pos="9160"/>
-          <w:tab w:val="left" w:pos="10076"/>
-          <w:tab w:val="left" w:pos="10992"/>
-          <w:tab w:val="left" w:pos="11908"/>
-          <w:tab w:val="left" w:pos="12824"/>
-          <w:tab w:val="left" w:pos="13740"/>
-          <w:tab w:val="left" w:pos="14656"/>
-        </w:tabs>
-        <w:spacing w:after="0" w:line="240" w:lineRule="auto"/>
-        <w:rPr>
-          <w:rFonts w:ascii="Courier New" w:eastAsia="Times New Roman" w:hAnsi="Courier New" w:cs="Courier New"/>
-          <w:sz w:val="20"/>
-          <w:szCs w:val="20"/>
-        </w:rPr>
-      </w:pPr>
+      <w:proofErr w:type="spellEnd"/>
+    </w:p>
+    <w:p>
+      <w:pPr>
+        <w:tabs>
+          <w:tab w:val="left" w:pos="916"/>
+          <w:tab w:val="left" w:pos="1832"/>
+          <w:tab w:val="left" w:pos="2748"/>
+          <w:tab w:val="left" w:pos="3664"/>
+          <w:tab w:val="left" w:pos="4580"/>
+          <w:tab w:val="left" w:pos="5496"/>
+          <w:tab w:val="left" w:pos="6412"/>
+          <w:tab w:val="left" w:pos="7328"/>
+          <w:tab w:val="left" w:pos="8244"/>
+          <w:tab w:val="left" w:pos="9160"/>
+          <w:tab w:val="left" w:pos="10076"/>
+          <w:tab w:val="left" w:pos="10992"/>
+          <w:tab w:val="left" w:pos="11908"/>
+          <w:tab w:val="left" w:pos="12824"/>
+          <w:tab w:val="left" w:pos="13740"/>
+          <w:tab w:val="left" w:pos="14656"/>
+        </w:tabs>
+        <w:spacing w:after="0" w:line="240" w:lineRule="auto"/>
+        <w:rPr>
+          <w:rFonts w:ascii="Courier New" w:eastAsia="Times New Roman" w:hAnsi="Courier New" w:cs="Courier New"/>
+          <w:sz w:val="20"/>
+          <w:szCs w:val="20"/>
+        </w:rPr>
+      </w:pPr>
+      <w:proofErr w:type="spellStart"/>
       <w:r>
         <w:rPr>
           <w:rFonts w:ascii="Courier New" w:eastAsia="Times New Roman" w:hAnsi="Courier New" w:cs="Courier New"/>
@@ -9558,6 +9697,7 @@
         </w:rPr>
         <w:t>AbuseIPDB</w:t>
       </w:r>
+      <w:proofErr w:type="spellEnd"/>
     </w:p>
     <w:p>
       <w:pPr>
@@ -9593,6 +9733,23 @@
           <w:szCs w:val="24"/>
         </w:rPr>
         <w:t>.</w:t>
+      </w:r>
+    </w:p>
+    <w:p>
+      <w:r>
+        <w:br/>
+        <w:t>plan time chart</w:t>
+      </w:r>
+      <w:r>
+        <w:br/>
+      </w:r>
+      <w:proofErr w:type="spellStart"/>
+      <w:r>
+        <w:t>github</w:t>
+      </w:r>
+      <w:proofErr w:type="spellEnd"/>
+      <w:r>
+        <w:t xml:space="preserve"> update regularly </w:t>
       </w:r>
     </w:p>
     <w:p/>

</xml_diff>